<commit_message>
Render UML with PlantUML and update the report diagram
</commit_message>
<xml_diff>
--- a/docs/SDP_Assignment_4_Facade_Report.docx
+++ b/docs/SDP_Assignment_4_Facade_Report.docx
@@ -938,7 +938,7 @@
       <w:r>
         <w:drawing>
           <wp:inline xmlns:a="http://schemas.openxmlformats.org/drawingml/2006/main" xmlns:pic="http://schemas.openxmlformats.org/drawingml/2006/picture">
-            <wp:extent cx="6080760" cy="5472684"/>
+            <wp:extent cx="6080760" cy="5732476"/>
             <wp:docPr id="1" name="Picture 1"/>
             <wp:cNvGraphicFramePr>
               <a:graphicFrameLocks noChangeAspect="1"/>
@@ -959,7 +959,7 @@
                   <pic:spPr>
                     <a:xfrm>
                       <a:off x="0" y="0"/>
-                      <a:ext cx="6080760" cy="5472684"/>
+                      <a:ext cx="6080760" cy="5732476"/>
                     </a:xfrm>
                     <a:prstGeom prst="rect"/>
                   </pic:spPr>
@@ -975,12 +975,12 @@
         <w:pStyle w:val="Caption"/>
       </w:pPr>
       <w:r>
-        <w:t>Figure 1. Facade, application client and collaborating subsystem classes.</w:t>
+        <w:t>Figure 1. PlantUML class diagram of the facade, client and subsystem classes.</w:t>
       </w:r>
     </w:p>
     <w:p>
       <w:r>
-        <w:t>Solid arrows show stored references. Dashed arrows show dependencies, including the client using the facade and the projector receiving a screen. The diagram omits constants, some observation getters, static markers, private helpers and the package-private test constructor for readability.</w:t>
+        <w:t>Solid arrows show stored references. Dashed arrows show dependencies, including the client using the facade and the projector receiving a screen. The diagram omits constants, some observation getters, private helpers and the package-private test constructor for readability.</w:t>
       </w:r>
     </w:p>
     <w:p>

</xml_diff>